<commit_message>
Apply confirmed decisions to website brief: booking funnel, no proof, devotional link
Co-Authored-By: Claude Opus 5.5 <noreply@anthropic.com>
Claude-Session: https://claude.ai/code/session_01QtsEaUnHz7gtTApzgSGYm3
</commit_message>
<xml_diff>
--- a/website/Website Restructure and Build Brief.docx
+++ b/website/Website Restructure and Build Brief.docx
@@ -30,7 +30,7 @@
         <w:rPr>
           <w:color w:val="8F7166"/>
         </w:rPr>
-        <w:t>Read This First: Assumptions and Open Questions</w:t>
+        <w:t>Read This First: Decisions and Assumptions</w:t>
       </w:r>
     </w:p>
     <w:p>
@@ -39,7 +39,16 @@
           <w:b/>
           <w:i w:val="0"/>
         </w:rPr>
-        <w:t>I could not open iamnechellemarie.com. My environment blocks outside websites. The diagnosis below is built from the known problems you listed, the approved Homepage Copy doc, the Now What? guide, and the welcome sequence in your Drive. Send screenshots of the live homepage (phone and desktop) and I will confirm every point and verify the palette.</w:t>
+        <w:t>I could not open iamnechellemarie.com. My environment blocks outside websites. The diagnosis is built from the known problems you listed, the approved Homepage Copy doc, the Now What? guide, and the welcome sequence in your Drive. Send phone and desktop screenshots of the live homepage and I will confirm every point and verify the palette.</w:t>
+      </w:r>
+    </w:p>
+    <w:p>
+      <w:r>
+        <w:rPr>
+          <w:b/>
+          <w:i w:val="0"/>
+        </w:rPr>
+        <w:t>Confirmed decisions:</w:t>
       </w:r>
     </w:p>
     <w:p>
@@ -47,7 +56,7 @@
         <w:pStyle w:val="ListNumber"/>
       </w:pPr>
       <w:r>
-        <w:t>Booking funnel conflict. This brief says checkout lives at /book-your-next-step with a hidden /choose-your-time page. On October 15 you had me switch the Your Next Step buttons back to Calendly, and you confirmed it works. Which one is live? Every homepage link in this brief points to /your-next-step, so the homepage is correct either way. Only the tracking setup for completed bookings changes.</w:t>
+        <w:t>Booking lives on your website. Your Next Step is sold through a systeme.io checkout at /book-your-next-step, followed by a hidden calendar page at /choose-your-time. Full build steps are in Deliverable 2, Section 8.</w:t>
       </w:r>
     </w:p>
     <w:p>
@@ -55,7 +64,7 @@
         <w:pStyle w:val="ListNumber"/>
       </w:pPr>
       <w:r>
-        <w:t>Proof. The only testimonial on file is the client quote in your Homepage Copy doc, marked “publish only after written permission.” Do you have that permission? If not, the Proof section stays off the page. I have not written or implied any other testimonial.</w:t>
+        <w:t>No testimonials. The Proof section is removed from the homepage.</w:t>
       </w:r>
     </w:p>
     <w:p>
@@ -63,7 +72,7 @@
         <w:pStyle w:val="ListNumber"/>
       </w:pPr>
       <w:r>
-        <w:t>Credentials. The old homepage carried “Certified in healing. Degree in Psychology and Brain Science.” Your verified title line is Empowerment Strategist, Certified Life Coach, Founder of People of Valor. This brief uses only the verified line. Confirm before anything else is added.</w:t>
+        <w:t>No added credentials. Only the verified title line appears anywhere: Empowerment Strategist, Certified Life Coach, Founder of People of Valor.</w:t>
       </w:r>
     </w:p>
     <w:p>
@@ -71,7 +80,7 @@
         <w:pStyle w:val="ListNumber"/>
       </w:pPr>
       <w:r>
-        <w:t>“Accomplished.” Your Brand Voice Smart Card says never call her “accomplished women.” Welcome Emails 1 and 2 still use that phrase. The site copy below avoids it. Do you want the two emails corrected?</w:t>
+        <w:t>Welcome sequence corrected: “accomplished women” replaced in Emails 1 and 2, and the masterclass P.S. removed from Email 5 so the sequence ends on People of Valor. The corrected sequence is saved as a new Google Doc.</w:t>
       </w:r>
     </w:p>
     <w:p>
@@ -79,7 +88,7 @@
         <w:pStyle w:val="ListNumber"/>
       </w:pPr>
       <w:r>
-        <w:t>Stop Faking Masterclass. Welcome Email 5 ends with a waitlist link for the masterclass. Is that waitlist live? If not, remove the P.S. so the sequence ends cleanly on People of Valor, as this brief intends.</w:t>
+        <w:t>Amazon devotional: 30 Days Growing in Christ (https://a.co/d/0jfoAnho). Confirm the exact title capitalization matches the Amazon listing.</w:t>
       </w:r>
     </w:p>
     <w:p>
@@ -87,23 +96,24 @@
         <w:pStyle w:val="ListNumber"/>
       </w:pPr>
       <w:r>
-        <w:t>Amazon devotional. I need the exact title and Amazon link for the 30 day devotional.</w:t>
+        <w:t>Guide delivery by email only. The thank you page has no download button.</w:t>
+      </w:r>
+    </w:p>
+    <w:p>
+      <w:r>
+        <w:rPr>
+          <w:b/>
+          <w:i w:val="0"/>
+        </w:rPr>
+        <w:t>Assumption to confirm:</w:t>
       </w:r>
     </w:p>
     <w:p>
       <w:pPr>
-        <w:pStyle w:val="ListNumber"/>
+        <w:pStyle w:val="ListBullet"/>
       </w:pPr>
       <w:r>
-        <w:t>YouTube Shorts links. YouTube made links in Shorts descriptions and comments unclickable in 2023. A pinned comment link will not be tappable. Use the link on your channel page, and say “link on my channel” in the video. Confirm this matches what you see in YouTube Studio.</w:t>
-      </w:r>
-    </w:p>
-    <w:p>
-      <w:pPr>
-        <w:pStyle w:val="ListNumber"/>
-      </w:pPr>
-      <w:r>
-        <w:t>Guide delivery. Your welcome sequence setup puts a download on the thank you page. This brief delivers the guide by email only, as you specified. That confirms real email addresses and gets Email 1 opened. Remove the download button from the thank you page.</w:t>
+        <w:t>YouTube Shorts links: links in Shorts descriptions and comments are not clickable, so YouTube traffic uses your channel page link and the spoken line “link on my channel.” Check this against YouTube Studio.</w:t>
       </w:r>
     </w:p>
     <w:p>
@@ -427,7 +437,7 @@
           </w:tcPr>
           <w:p>
             <w:r>
-              <w:t>Lower impact than the items above for a free guide, but it matters for Your Next Step. Solve with permission, not invention.</w:t>
+              <w:t>Lowest impact for a free guide. By your decision, none are added; your own story in the About teaser carries the trust instead.</w:t>
             </w:r>
           </w:p>
         </w:tc>
@@ -796,7 +806,7 @@
           </w:tcPr>
           <w:p>
             <w:r>
-              <w:t>Proof (only with permission)</w:t>
+              <w:t>Your Next Step teaser</w:t>
             </w:r>
           </w:p>
         </w:tc>
@@ -806,7 +816,7 @@
           </w:tcPr>
           <w:p>
             <w:r>
-              <w:t>Show a real woman who moved</w:t>
+              <w:t>Offer more to the woman ready for one on one help</w:t>
             </w:r>
           </w:p>
         </w:tc>
@@ -816,7 +826,7 @@
           </w:tcPr>
           <w:p>
             <w:r>
-              <w:t>“It worked for someone like me.”</w:t>
+              <w:t>“I want help now, not just a guide.”</w:t>
             </w:r>
           </w:p>
         </w:tc>
@@ -826,7 +836,7 @@
           </w:tcPr>
           <w:p>
             <w:r>
-              <w:t>Send Me the Guide</w:t>
+              <w:t>Go to /your-next-step</w:t>
             </w:r>
           </w:p>
         </w:tc>
@@ -848,7 +858,7 @@
           </w:tcPr>
           <w:p>
             <w:r>
-              <w:t>Your Next Step teaser</w:t>
+              <w:t>About teaser</w:t>
             </w:r>
           </w:p>
         </w:tc>
@@ -858,7 +868,7 @@
           </w:tcPr>
           <w:p>
             <w:r>
-              <w:t>Offer more to the woman ready for one on one help</w:t>
+              <w:t>Establish who is guiding her</w:t>
             </w:r>
           </w:p>
         </w:tc>
@@ -868,7 +878,7 @@
           </w:tcPr>
           <w:p>
             <w:r>
-              <w:t>“I want help now, not just a guide.”</w:t>
+              <w:t>“Why should I listen to her?”</w:t>
             </w:r>
           </w:p>
         </w:tc>
@@ -878,7 +888,7 @@
           </w:tcPr>
           <w:p>
             <w:r>
-              <w:t>Go to /your-next-step</w:t>
+              <w:t>Read Nechelle’s story (About)</w:t>
             </w:r>
           </w:p>
         </w:tc>
@@ -900,7 +910,7 @@
           </w:tcPr>
           <w:p>
             <w:r>
-              <w:t>About teaser</w:t>
+              <w:t>Community invitation</w:t>
             </w:r>
           </w:p>
         </w:tc>
@@ -910,7 +920,7 @@
           </w:tcPr>
           <w:p>
             <w:r>
-              <w:t>Establish who is guiding her</w:t>
+              <w:t>Show where she will not be alone</w:t>
             </w:r>
           </w:p>
         </w:tc>
@@ -920,7 +930,7 @@
           </w:tcPr>
           <w:p>
             <w:r>
-              <w:t>“Why should I listen to her?”</w:t>
+              <w:t>“I do not want to do this alone.”</w:t>
             </w:r>
           </w:p>
         </w:tc>
@@ -930,7 +940,7 @@
           </w:tcPr>
           <w:p>
             <w:r>
-              <w:t>Read Nechelle’s story (About)</w:t>
+              <w:t>Join People of Valor Free</w:t>
             </w:r>
           </w:p>
         </w:tc>
@@ -952,7 +962,7 @@
           </w:tcPr>
           <w:p>
             <w:r>
-              <w:t>Community invitation</w:t>
+              <w:t>Final call to action</w:t>
             </w:r>
           </w:p>
         </w:tc>
@@ -962,7 +972,7 @@
           </w:tcPr>
           <w:p>
             <w:r>
-              <w:t>Show where she will not be alone</w:t>
+              <w:t>Close with the one ask</w:t>
             </w:r>
           </w:p>
         </w:tc>
@@ -972,7 +982,7 @@
           </w:tcPr>
           <w:p>
             <w:r>
-              <w:t>“I do not want to do this alone.”</w:t>
+              <w:t>“Okay. I will take the first step.”</w:t>
             </w:r>
           </w:p>
         </w:tc>
@@ -982,7 +992,7 @@
           </w:tcPr>
           <w:p>
             <w:r>
-              <w:t>Join People of Valor Free</w:t>
+              <w:t>Send Me the Guide</w:t>
             </w:r>
           </w:p>
         </w:tc>
@@ -995,58 +1005,6 @@
           <w:p>
             <w:r>
               <w:t>10</w:t>
-            </w:r>
-          </w:p>
-        </w:tc>
-        <w:tc>
-          <w:tcPr>
-            <w:tcW w:type="dxa" w:w="1728"/>
-          </w:tcPr>
-          <w:p>
-            <w:r>
-              <w:t>Final call to action</w:t>
-            </w:r>
-          </w:p>
-        </w:tc>
-        <w:tc>
-          <w:tcPr>
-            <w:tcW w:type="dxa" w:w="1728"/>
-          </w:tcPr>
-          <w:p>
-            <w:r>
-              <w:t>Close with the one ask</w:t>
-            </w:r>
-          </w:p>
-        </w:tc>
-        <w:tc>
-          <w:tcPr>
-            <w:tcW w:type="dxa" w:w="1728"/>
-          </w:tcPr>
-          <w:p>
-            <w:r>
-              <w:t>“Okay. I will take the first step.”</w:t>
-            </w:r>
-          </w:p>
-        </w:tc>
-        <w:tc>
-          <w:tcPr>
-            <w:tcW w:type="dxa" w:w="1728"/>
-          </w:tcPr>
-          <w:p>
-            <w:r>
-              <w:t>Send Me the Guide</w:t>
-            </w:r>
-          </w:p>
-        </w:tc>
-      </w:tr>
-      <w:tr>
-        <w:tc>
-          <w:tcPr>
-            <w:tcW w:type="dxa" w:w="1728"/>
-          </w:tcPr>
-          <w:p>
-            <w:r>
-              <w:t>11</w:t>
             </w:r>
           </w:p>
         </w:tc>
@@ -1442,7 +1400,7 @@
         <w:t xml:space="preserve">Button [approved]  </w:t>
       </w:r>
       <w:r>
-        <w:t>Start With Step One: Get the Free Guide (scrolls to the Section 10 form)</w:t>
+        <w:t>Start With Step One: Get the Free Guide (scrolls to the Section 9 form)</w:t>
       </w:r>
     </w:p>
     <w:p>
@@ -1522,7 +1480,7 @@
         <w:t xml:space="preserve">Button [approved]  </w:t>
       </w:r>
       <w:r>
-        <w:t>Send Me the Guide (scrolls to the Section 10 form)</w:t>
+        <w:t>Send Me the Guide (scrolls to the Section 9 form)</w:t>
       </w:r>
     </w:p>
     <w:p>
@@ -1542,51 +1500,7 @@
         <w:rPr>
           <w:color w:val="8F7166"/>
         </w:rPr>
-        <w:t>Section 6: Proof (only with written permission)</w:t>
-      </w:r>
-    </w:p>
-    <w:p>
-      <w:r>
-        <w:rPr>
-          <w:b/>
-          <w:color w:val="5E4B42"/>
-        </w:rPr>
-        <w:t xml:space="preserve">Quote [approved, pending permission]  </w:t>
-      </w:r>
-      <w:r>
-        <w:t>“Because of you, I have now been able to speak up for myself. Before working with you, I would just let people say and do whatever, but now I say no and push back and don’t feel guilty about it.”</w:t>
-      </w:r>
-    </w:p>
-    <w:p>
-      <w:r>
-        <w:rPr>
-          <w:b/>
-          <w:color w:val="5E4B42"/>
-        </w:rPr>
-        <w:t xml:space="preserve">Attribution  </w:t>
-      </w:r>
-      <w:r>
-        <w:t>[Client first name or initial]</w:t>
-      </w:r>
-    </w:p>
-    <w:p>
-      <w:r>
-        <w:rPr>
-          <w:i/>
-          <w:color w:val="5E4B42"/>
-        </w:rPr>
-        <w:t>Leave this section off the page until you confirm permission. Nothing replaces it in the meantime.</w:t>
-      </w:r>
-    </w:p>
-    <w:p>
-      <w:pPr>
-        <w:pStyle w:val="Heading3"/>
-      </w:pPr>
-      <w:r>
-        <w:rPr>
-          <w:color w:val="8F7166"/>
-        </w:rPr>
-        <w:t>Section 7: Your Next Step Teaser</w:t>
+        <w:t>Section 6: Your Next Step Teaser</w:t>
       </w:r>
     </w:p>
     <w:p>
@@ -1689,7 +1603,7 @@
         <w:rPr>
           <w:color w:val="8F7166"/>
         </w:rPr>
-        <w:t>Section 8: About Teaser</w:t>
+        <w:t>Section 7: About Teaser</w:t>
       </w:r>
     </w:p>
     <w:p>
@@ -1760,7 +1674,7 @@
         <w:rPr>
           <w:color w:val="8F7166"/>
         </w:rPr>
-        <w:t>Section 9: Community Invitation</w:t>
+        <w:t>Section 8: Community Invitation</w:t>
       </w:r>
     </w:p>
     <w:p>
@@ -1816,7 +1730,7 @@
         <w:rPr>
           <w:color w:val="8F7166"/>
         </w:rPr>
-        <w:t>Section 10: Final Call to Action</w:t>
+        <w:t>Section 9: Final Call to Action</w:t>
       </w:r>
     </w:p>
     <w:p>
@@ -1887,7 +1801,7 @@
         <w:rPr>
           <w:color w:val="8F7166"/>
         </w:rPr>
-        <w:t>Section 11: Footer</w:t>
+        <w:t>Section 10: Footer</w:t>
       </w:r>
     </w:p>
     <w:p>
@@ -1935,7 +1849,7 @@
         <w:t xml:space="preserve">Quiet line [new]  </w:t>
       </w:r>
       <w:r>
-        <w:t>30 day devotional on Amazon (title and link needed)</w:t>
+        <w:t>Devotional: 30 Days Growing in Christ (https://a.co/d/0jfoAnho)</w:t>
       </w:r>
     </w:p>
     <w:p>
@@ -2236,7 +2150,7 @@
           </w:tcPr>
           <w:p>
             <w:r>
-              <w:t>One quiet line near the end</w:t>
+              <w:t>One quiet line near the end: 30 Days Growing in Christ</w:t>
             </w:r>
           </w:p>
         </w:tc>
@@ -3011,7 +2925,7 @@
           </w:tcPr>
           <w:p>
             <w:r>
-              <w:t>Scroll to Section 10 form</w:t>
+              <w:t>Scroll to Section 9 form</w:t>
             </w:r>
           </w:p>
         </w:tc>
@@ -3063,7 +2977,7 @@
           </w:tcPr>
           <w:p>
             <w:r>
-              <w:t>Scroll to Section 10 form</w:t>
+              <w:t>Scroll to Section 9 form</w:t>
             </w:r>
           </w:p>
         </w:tc>
@@ -3075,7 +2989,7 @@
           </w:tcPr>
           <w:p>
             <w:r>
-              <w:t>6 Proof</w:t>
+              <w:t>6 Your Next Step</w:t>
             </w:r>
           </w:p>
         </w:tc>
@@ -3085,7 +2999,7 @@
           </w:tcPr>
           <w:p>
             <w:r>
-              <w:t>Soft blush beige</w:t>
+              <w:t>White</w:t>
             </w:r>
           </w:p>
         </w:tc>
@@ -3095,7 +3009,7 @@
           </w:tcPr>
           <w:p>
             <w:r>
-              <w:t>Quote card (hidden until permission)</w:t>
+              <w:t>Label, H2, paragraph, button</w:t>
             </w:r>
           </w:p>
         </w:tc>
@@ -3105,7 +3019,7 @@
           </w:tcPr>
           <w:p>
             <w:r>
-              <w:t>None</w:t>
+              <w:t>Book Your Next Step</w:t>
             </w:r>
           </w:p>
         </w:tc>
@@ -3115,7 +3029,7 @@
           </w:tcPr>
           <w:p>
             <w:r>
-              <w:t>None</w:t>
+              <w:t>/your-next-step</w:t>
             </w:r>
           </w:p>
         </w:tc>
@@ -3127,7 +3041,7 @@
           </w:tcPr>
           <w:p>
             <w:r>
-              <w:t>7 Your Next Step</w:t>
+              <w:t>7 About teaser</w:t>
             </w:r>
           </w:p>
         </w:tc>
@@ -3137,7 +3051,7 @@
           </w:tcPr>
           <w:p>
             <w:r>
-              <w:t>White</w:t>
+              <w:t>Dusty rose</w:t>
             </w:r>
           </w:p>
         </w:tc>
@@ -3147,7 +3061,7 @@
           </w:tcPr>
           <w:p>
             <w:r>
-              <w:t>Label, H2, paragraph, button</w:t>
+              <w:t>Photo, H2, title line, two paragraphs, text link</w:t>
             </w:r>
           </w:p>
         </w:tc>
@@ -3157,7 +3071,7 @@
           </w:tcPr>
           <w:p>
             <w:r>
-              <w:t>Book Your Next Step</w:t>
+              <w:t>Read my story</w:t>
             </w:r>
           </w:p>
         </w:tc>
@@ -3167,7 +3081,7 @@
           </w:tcPr>
           <w:p>
             <w:r>
-              <w:t>/your-next-step</w:t>
+              <w:t>/about</w:t>
             </w:r>
           </w:p>
         </w:tc>
@@ -3179,7 +3093,7 @@
           </w:tcPr>
           <w:p>
             <w:r>
-              <w:t>8 About teaser</w:t>
+              <w:t>8 Community</w:t>
             </w:r>
           </w:p>
         </w:tc>
@@ -3189,7 +3103,7 @@
           </w:tcPr>
           <w:p>
             <w:r>
-              <w:t>Dusty rose</w:t>
+              <w:t>Soft blush beige</w:t>
             </w:r>
           </w:p>
         </w:tc>
@@ -3199,7 +3113,7 @@
           </w:tcPr>
           <w:p>
             <w:r>
-              <w:t>Photo, H2, title line, two paragraphs, text link</w:t>
+              <w:t>H2, paragraph, secondary button</w:t>
             </w:r>
           </w:p>
         </w:tc>
@@ -3209,7 +3123,7 @@
           </w:tcPr>
           <w:p>
             <w:r>
-              <w:t>Read my story</w:t>
+              <w:t>Join People of Valor Free</w:t>
             </w:r>
           </w:p>
         </w:tc>
@@ -3219,7 +3133,7 @@
           </w:tcPr>
           <w:p>
             <w:r>
-              <w:t>/about</w:t>
+              <w:t>Skool link</w:t>
             </w:r>
           </w:p>
         </w:tc>
@@ -3231,59 +3145,7 @@
           </w:tcPr>
           <w:p>
             <w:r>
-              <w:t>9 Community</w:t>
-            </w:r>
-          </w:p>
-        </w:tc>
-        <w:tc>
-          <w:tcPr>
-            <w:tcW w:type="dxa" w:w="1728"/>
-          </w:tcPr>
-          <w:p>
-            <w:r>
-              <w:t>Soft blush beige</w:t>
-            </w:r>
-          </w:p>
-        </w:tc>
-        <w:tc>
-          <w:tcPr>
-            <w:tcW w:type="dxa" w:w="1728"/>
-          </w:tcPr>
-          <w:p>
-            <w:r>
-              <w:t>H2, paragraph, secondary button</w:t>
-            </w:r>
-          </w:p>
-        </w:tc>
-        <w:tc>
-          <w:tcPr>
-            <w:tcW w:type="dxa" w:w="1728"/>
-          </w:tcPr>
-          <w:p>
-            <w:r>
-              <w:t>Join People of Valor Free</w:t>
-            </w:r>
-          </w:p>
-        </w:tc>
-        <w:tc>
-          <w:tcPr>
-            <w:tcW w:type="dxa" w:w="1728"/>
-          </w:tcPr>
-          <w:p>
-            <w:r>
-              <w:t>Skool link</w:t>
-            </w:r>
-          </w:p>
-        </w:tc>
-      </w:tr>
-      <w:tr>
-        <w:tc>
-          <w:tcPr>
-            <w:tcW w:type="dxa" w:w="1728"/>
-          </w:tcPr>
-          <w:p>
-            <w:r>
-              <w:t>10 Final CTA</w:t>
+              <w:t>9 Final CTA</w:t>
             </w:r>
           </w:p>
         </w:tc>
@@ -3692,7 +3554,7 @@
           </w:tcPr>
           <w:p>
             <w:r>
-              <w:t>Checkout (if live; see open question 1)</w:t>
+              <w:t>Checkout, $125 (see Section 8)</w:t>
             </w:r>
           </w:p>
         </w:tc>
@@ -4317,7 +4179,7 @@
           </w:tcPr>
           <w:p>
             <w:r>
-              <w:t>Replace with the footer in Section 11.</w:t>
+              <w:t>Replace with the footer in Section 10.</w:t>
             </w:r>
           </w:p>
         </w:tc>
@@ -4793,7 +4655,7 @@
           </w:tcPr>
           <w:p>
             <w:r>
-              <w:t>If systeme.io checkout is live: Sales report for the Your Next Step product. If Calendly is live: scheduled events for that event type, matched to Stripe and PayPal payments.</w:t>
+              <w:t>Every paid order on /book-your-next-step adds the tag Your Next Step Client. Cross check against the calendar’s booked sessions each week.</w:t>
             </w:r>
           </w:p>
         </w:tc>
@@ -4803,7 +4665,7 @@
           </w:tcPr>
           <w:p>
             <w:r>
-              <w:t>Weekly count of paid sessions.</w:t>
+              <w:t>systeme.io Sales report for the Your Next Step product, and the tag count.</w:t>
             </w:r>
           </w:p>
         </w:tc>
@@ -4961,7 +4823,7 @@
           </w:tcPr>
           <w:p>
             <w:r>
-              <w:t>1. Opt in pages /now-what, /now-what-tiktok, /now-what-youtube with tagged forms. 2. Thank you page. 3. Welcome sequence live and tested. 4. Bio links updated. 5. Homepage hero replaced with the new headline and opt in form. 6. Remove Book Now, Calendly, More info links, scripture quote, stray text. 7. Footer fixed and copyright 2026.</w:t>
+              <w:t>1. Opt in pages /now-what, /now-what-tiktok, /now-what-youtube with tagged forms. 2. Thank you page. 3. Welcome sequence live and tested. 4. Bio links updated. 5. Booking funnel on your website (Section 8) tested with one real purchase. 6. Homepage hero replaced with the new headline and opt in form. 7. Remove Book Now, Calendly, More info links, scripture quote, stray text. 8. Footer fixed and copyright 2026.</w:t>
             </w:r>
           </w:p>
         </w:tc>
@@ -5005,7 +4867,7 @@
           </w:tcPr>
           <w:p>
             <w:r>
-              <w:t>About, Blog, and Contact link placements. Amazon devotional line once you send the title and link. Proof section once permission is confirmed. Test Option B headline on one opt in page after two weeks of baseline data.</w:t>
+              <w:t>About, Blog, and Contact link placements. Amazon devotional line in About and the footer. Test Option B headline on one opt in page after two weeks of baseline data.</w:t>
             </w:r>
           </w:p>
         </w:tc>
@@ -5034,6 +4896,444 @@
       </w:tr>
     </w:tbl>
     <w:p/>
+    <w:p>
+      <w:pPr>
+        <w:pStyle w:val="Heading2"/>
+      </w:pPr>
+      <w:r>
+        <w:rPr>
+          <w:color w:val="8F7166"/>
+        </w:rPr>
+        <w:t>8. Booking on Your Website: Your Next Step</w:t>
+      </w:r>
+    </w:p>
+    <w:p>
+      <w:r>
+        <w:rPr>
+          <w:b/>
+          <w:i w:val="0"/>
+        </w:rPr>
+        <w:t>The full path: homepage teaser or menu, then /your-next-step, then checkout, then the calendar. Nothing links to checkout except the /your-next-step page, and nothing links to the calendar at all.</w:t>
+      </w:r>
+    </w:p>
+    <w:tbl>
+      <w:tblPr>
+        <w:tblStyle w:val="LightGrid-Accent1"/>
+        <w:tblW w:type="auto" w:w="0"/>
+        <w:tblLook w:firstColumn="1" w:firstRow="1" w:lastColumn="0" w:lastRow="0" w:noHBand="0" w:noVBand="1" w:val="04A0"/>
+      </w:tblPr>
+      <w:tblGrid>
+        <w:gridCol w:w="2160"/>
+        <w:gridCol w:w="2160"/>
+        <w:gridCol w:w="2160"/>
+        <w:gridCol w:w="2160"/>
+      </w:tblGrid>
+      <w:tr>
+        <w:tc>
+          <w:tcPr>
+            <w:tcW w:type="dxa" w:w="2160"/>
+          </w:tcPr>
+          <w:p>
+            <w:r>
+              <w:t>Step</w:t>
+            </w:r>
+          </w:p>
+        </w:tc>
+        <w:tc>
+          <w:tcPr>
+            <w:tcW w:type="dxa" w:w="2160"/>
+          </w:tcPr>
+          <w:p>
+            <w:r>
+              <w:t>Path</w:t>
+            </w:r>
+          </w:p>
+        </w:tc>
+        <w:tc>
+          <w:tcPr>
+            <w:tcW w:type="dxa" w:w="2160"/>
+          </w:tcPr>
+          <w:p>
+            <w:r>
+              <w:t>What it is</w:t>
+            </w:r>
+          </w:p>
+        </w:tc>
+        <w:tc>
+          <w:tcPr>
+            <w:tcW w:type="dxa" w:w="2160"/>
+          </w:tcPr>
+          <w:p>
+            <w:r>
+              <w:t>Search engines</w:t>
+            </w:r>
+          </w:p>
+        </w:tc>
+      </w:tr>
+      <w:tr>
+        <w:tc>
+          <w:tcPr>
+            <w:tcW w:type="dxa" w:w="2160"/>
+          </w:tcPr>
+          <w:p>
+            <w:r>
+              <w:t>1</w:t>
+            </w:r>
+          </w:p>
+        </w:tc>
+        <w:tc>
+          <w:tcPr>
+            <w:tcW w:type="dxa" w:w="2160"/>
+          </w:tcPr>
+          <w:p>
+            <w:r>
+              <w:t>/your-next-step</w:t>
+            </w:r>
+          </w:p>
+        </w:tc>
+        <w:tc>
+          <w:tcPr>
+            <w:tcW w:type="dxa" w:w="2160"/>
+          </w:tcPr>
+          <w:p>
+            <w:r>
+              <w:t>Approved landing page. All three buttons link to /book-your-next-step.</w:t>
+            </w:r>
+          </w:p>
+        </w:tc>
+        <w:tc>
+          <w:tcPr>
+            <w:tcW w:type="dxa" w:w="2160"/>
+          </w:tcPr>
+          <w:p>
+            <w:r>
+              <w:t>Indexed</w:t>
+            </w:r>
+          </w:p>
+        </w:tc>
+      </w:tr>
+      <w:tr>
+        <w:tc>
+          <w:tcPr>
+            <w:tcW w:type="dxa" w:w="2160"/>
+          </w:tcPr>
+          <w:p>
+            <w:r>
+              <w:t>2</w:t>
+            </w:r>
+          </w:p>
+        </w:tc>
+        <w:tc>
+          <w:tcPr>
+            <w:tcW w:type="dxa" w:w="2160"/>
+          </w:tcPr>
+          <w:p>
+            <w:r>
+              <w:t>/book-your-next-step</w:t>
+            </w:r>
+          </w:p>
+        </w:tc>
+        <w:tc>
+          <w:tcPr>
+            <w:tcW w:type="dxa" w:w="2160"/>
+          </w:tcPr>
+          <w:p>
+            <w:r>
+              <w:t>systeme.io order form: product Your Next Step: 60-Minute Private Coaching Session, $125 one time, Stripe and PayPal on.</w:t>
+            </w:r>
+          </w:p>
+        </w:tc>
+        <w:tc>
+          <w:tcPr>
+            <w:tcW w:type="dxa" w:w="2160"/>
+          </w:tcPr>
+          <w:p>
+            <w:r>
+              <w:t>Noindex</w:t>
+            </w:r>
+          </w:p>
+        </w:tc>
+      </w:tr>
+      <w:tr>
+        <w:tc>
+          <w:tcPr>
+            <w:tcW w:type="dxa" w:w="2160"/>
+          </w:tcPr>
+          <w:p>
+            <w:r>
+              <w:t>3</w:t>
+            </w:r>
+          </w:p>
+        </w:tc>
+        <w:tc>
+          <w:tcPr>
+            <w:tcW w:type="dxa" w:w="2160"/>
+          </w:tcPr>
+          <w:p>
+            <w:r>
+              <w:t>/choose-your-time</w:t>
+            </w:r>
+          </w:p>
+        </w:tc>
+        <w:tc>
+          <w:tcPr>
+            <w:tcW w:type="dxa" w:w="2160"/>
+          </w:tcPr>
+          <w:p>
+            <w:r>
+              <w:t>Thank you step after payment with the systeme.io calendar element for the Your Next Step event.</w:t>
+            </w:r>
+          </w:p>
+        </w:tc>
+        <w:tc>
+          <w:tcPr>
+            <w:tcW w:type="dxa" w:w="2160"/>
+          </w:tcPr>
+          <w:p>
+            <w:r>
+              <w:t>Noindex, never linked</w:t>
+            </w:r>
+          </w:p>
+        </w:tc>
+      </w:tr>
+    </w:tbl>
+    <w:p/>
+    <w:p>
+      <w:r>
+        <w:rPr>
+          <w:b/>
+          <w:i w:val="0"/>
+        </w:rPr>
+        <w:t>Setup in systeme.io:</w:t>
+      </w:r>
+    </w:p>
+    <w:p>
+      <w:pPr>
+        <w:pStyle w:val="ListNumber"/>
+      </w:pPr>
+      <w:r>
+        <w:t>Settings: connect Stripe and PayPal as payment gateways.</w:t>
+      </w:r>
+    </w:p>
+    <w:p>
+      <w:pPr>
+        <w:pStyle w:val="ListNumber"/>
+      </w:pPr>
+      <w:r>
+        <w:t>Calendar: create the event Your Next Step, 60 minutes, your availability, your Zoom meeting link as the location so it appears in the confirmation email.</w:t>
+      </w:r>
+    </w:p>
+    <w:p>
+      <w:pPr>
+        <w:pStyle w:val="ListNumber"/>
+      </w:pPr>
+      <w:r>
+        <w:t>Create a funnel named Your Next Step with the three steps above, in that order. Paste the Your Next Step landing page code into step 1 (from the paste kit).</w:t>
+      </w:r>
+    </w:p>
+    <w:p>
+      <w:pPr>
+        <w:pStyle w:val="ListNumber"/>
+      </w:pPr>
+      <w:r>
+        <w:t>Order form: add a required checkbox: “I have read and agree to the Terms, including the 24-hour rescheduling policy and that payments are non-refundable.” Link the word Terms to /terms.</w:t>
+      </w:r>
+    </w:p>
+    <w:p>
+      <w:pPr>
+        <w:pStyle w:val="ListNumber"/>
+      </w:pPr>
+      <w:r>
+        <w:t>Order form automation: add tag Your Next Step Client on purchase.</w:t>
+      </w:r>
+    </w:p>
+    <w:p>
+      <w:pPr>
+        <w:pStyle w:val="ListNumber"/>
+      </w:pPr>
+      <w:r>
+        <w:t>Change the three Book Your Next Step buttons on the landing page from the Calendly link to /book-your-next-step. Then turn off the Calendly event so there is only one way to book.</w:t>
+      </w:r>
+    </w:p>
+    <w:p>
+      <w:pPr>
+        <w:pStyle w:val="ListNumber"/>
+      </w:pPr>
+      <w:r>
+        <w:t>Test with one real purchase on your phone from the homepage teaser to the confirmation email, then refund it.</w:t>
+      </w:r>
+    </w:p>
+    <w:p>
+      <w:r>
+        <w:rPr>
+          <w:b/>
+          <w:i w:val="0"/>
+        </w:rPr>
+        <w:t>Checkout page copy [approved]:</w:t>
+      </w:r>
+    </w:p>
+    <w:p>
+      <w:r>
+        <w:rPr>
+          <w:b/>
+          <w:color w:val="5E4B42"/>
+        </w:rPr>
+        <w:t xml:space="preserve">Headline  </w:t>
+      </w:r>
+      <w:r>
+        <w:t>Book Your Next Step</w:t>
+      </w:r>
+    </w:p>
+    <w:p>
+      <w:r>
+        <w:rPr>
+          <w:b/>
+          <w:color w:val="5E4B42"/>
+        </w:rPr>
+        <w:t xml:space="preserve">Body  </w:t>
+      </w:r>
+      <w:r>
+        <w:t>A 60-minute private coaching session on Zoom with Nechelle Marie.</w:t>
+      </w:r>
+    </w:p>
+    <w:p>
+      <w:r>
+        <w:rPr>
+          <w:b/>
+          <w:color w:val="5E4B42"/>
+        </w:rPr>
+        <w:t xml:space="preserve">Price  </w:t>
+      </w:r>
+      <w:r>
+        <w:t>$125, one-time payment</w:t>
+      </w:r>
+    </w:p>
+    <w:p>
+      <w:r>
+        <w:rPr>
+          <w:b/>
+          <w:color w:val="5E4B42"/>
+        </w:rPr>
+        <w:t xml:space="preserve">List  </w:t>
+      </w:r>
+      <w:r>
+        <w:t>You’ll leave with: One priority to focus on. A practical boundary to support your next step. A seven-day action plan that fits your life.</w:t>
+      </w:r>
+    </w:p>
+    <w:p>
+      <w:r>
+        <w:rPr>
+          <w:b/>
+          <w:color w:val="5E4B42"/>
+        </w:rPr>
+        <w:t xml:space="preserve">Line  </w:t>
+      </w:r>
+      <w:r>
+        <w:t>After payment, you’ll choose your session time on the next page.</w:t>
+      </w:r>
+    </w:p>
+    <w:p>
+      <w:r>
+        <w:rPr>
+          <w:b/>
+          <w:color w:val="5E4B42"/>
+        </w:rPr>
+        <w:t xml:space="preserve">Button  </w:t>
+      </w:r>
+      <w:r>
+        <w:t>Complete My Booking</w:t>
+      </w:r>
+    </w:p>
+    <w:p>
+      <w:r>
+        <w:rPr>
+          <w:b/>
+          <w:color w:val="5E4B42"/>
+        </w:rPr>
+        <w:t xml:space="preserve">Below button  </w:t>
+      </w:r>
+      <w:r>
+        <w:t>Secure payment through Stripe or PayPal.</w:t>
+      </w:r>
+    </w:p>
+    <w:p>
+      <w:r>
+        <w:rPr>
+          <w:b/>
+          <w:i w:val="0"/>
+        </w:rPr>
+        <w:t>Choose Your Time page copy [approved]:</w:t>
+      </w:r>
+    </w:p>
+    <w:p>
+      <w:r>
+        <w:rPr>
+          <w:b/>
+          <w:color w:val="5E4B42"/>
+        </w:rPr>
+        <w:t xml:space="preserve">Headline  </w:t>
+      </w:r>
+      <w:r>
+        <w:t>You’re in. Now choose your time.</w:t>
+      </w:r>
+    </w:p>
+    <w:p>
+      <w:r>
+        <w:rPr>
+          <w:b/>
+          <w:color w:val="5E4B42"/>
+        </w:rPr>
+        <w:t xml:space="preserve">Body  </w:t>
+      </w:r>
+      <w:r>
+        <w:t>Pick the day and time that work best for you. Your confirmation email will include the Zoom link for your session.</w:t>
+      </w:r>
+    </w:p>
+    <w:p>
+      <w:r>
+        <w:rPr>
+          <w:b/>
+          <w:color w:val="5E4B42"/>
+        </w:rPr>
+        <w:t xml:space="preserve">Calendar  </w:t>
+      </w:r>
+      <w:r>
+        <w:t>systeme.io calendar element: Your Next Step event</w:t>
+      </w:r>
+    </w:p>
+    <w:p>
+      <w:r>
+        <w:rPr>
+          <w:b/>
+          <w:color w:val="5E4B42"/>
+        </w:rPr>
+        <w:t xml:space="preserve">Below  </w:t>
+      </w:r>
+      <w:r>
+        <w:t>Need to reschedule? Email nechelle@iamnechellemarie.com at least 24 hours before your session.</w:t>
+      </w:r>
+    </w:p>
+    <w:p>
+      <w:r>
+        <w:rPr>
+          <w:b/>
+          <w:color w:val="5E4B42"/>
+        </w:rPr>
+        <w:t xml:space="preserve">Close  </w:t>
+      </w:r>
+      <w:r>
+        <w:t>I’m looking forward to our hour together. Nechelle Marie</w:t>
+      </w:r>
+    </w:p>
+    <w:p>
+      <w:r>
+        <w:rPr>
+          <w:b/>
+          <w:i w:val="0"/>
+        </w:rPr>
+        <w:t>Legal pages to update with this switch: the Terms and Privacy Policy currently name Calendly for scheduling. Switch them to systeme.io for checkout and scheduling. I will send the updated paste kit code when you confirm the switch date.</w:t>
+      </w:r>
+    </w:p>
     <w:sectPr>
       <w:pgSz w:w="12240" w:h="15840"/>
       <w:pgMar w:top="1440" w:right="1800" w:bottom="1440" w:left="1800" w:header="720" w:footer="720" w:gutter="0"/>

</xml_diff>

<commit_message>
Simplify homepage: remove method and first step sections, add guide pop up
Co-Authored-By: Claude Opus 5.5 <noreply@anthropic.com>
Claude-Session: https://claude.ai/code/session_01QtsEaUnHz7gtTApzgSGYm3
</commit_message>
<xml_diff>
--- a/website/Website Restructure and Build Brief.docx
+++ b/website/Website Restructure and Build Brief.docx
@@ -331,7 +331,7 @@
           </w:tcPr>
           <w:p>
             <w:r>
-              <w:t>Three pathways do not reflect the Anchor Method</w:t>
+              <w:t>Three vague pathways</w:t>
             </w:r>
           </w:p>
         </w:tc>
@@ -341,7 +341,7 @@
           </w:tcPr>
           <w:p>
             <w:r>
-              <w:t>Your method is the reason to trust you. Generic pathways hide the one thing that makes the guide and the community feel like a real path.</w:t>
+              <w:t>They do not tell her what you offer. Replace them with three clear cards: the free guide, Your Next Step, and People of Valor.</w:t>
             </w:r>
           </w:p>
         </w:tc>
@@ -461,7 +461,7 @@
           <w:i/>
           <w:color w:val="5E4B42"/>
         </w:rPr>
-        <w:t>Follows the guide’s sequence: You Are Not Behind, Why You Keep Circling Back, The Path Forward, Your First Step, Your Next Move.</w:t>
+        <w:t>Simplified October 15 at your direction: the homepage introduces who you are and what you offer, and does not teach the method. The guide is offered by pop up and at the end of the page.</w:t>
       </w:r>
     </w:p>
     <w:tbl>
@@ -546,7 +546,7 @@
           </w:tcPr>
           <w:p>
             <w:r>
-              <w:t>Hero with opt in</w:t>
+              <w:t>Hero</w:t>
             </w:r>
           </w:p>
         </w:tc>
@@ -556,7 +556,7 @@
           </w:tcPr>
           <w:p>
             <w:r>
-              <w:t>Prove in one screen that this is for her, and capture the email</w:t>
+              <w:t>Show who you are and who you serve</w:t>
             </w:r>
           </w:p>
         </w:tc>
@@ -566,7 +566,7 @@
           </w:tcPr>
           <w:p>
             <w:r>
-              <w:t>“Is this for me, or another coach talking to broken women?”</w:t>
+              <w:t>“Is this for me?”</w:t>
             </w:r>
           </w:p>
         </w:tc>
@@ -576,7 +576,7 @@
           </w:tcPr>
           <w:p>
             <w:r>
-              <w:t>Send Me the Guide</w:t>
+              <w:t>Get the Free Guide (scrolls to the end)</w:t>
             </w:r>
           </w:p>
         </w:tc>
@@ -650,215 +650,7 @@
           </w:tcPr>
           <w:p>
             <w:r>
-              <w:t>The Loop</w:t>
-            </w:r>
-          </w:p>
-        </w:tc>
-        <w:tc>
-          <w:tcPr>
-            <w:tcW w:type="dxa" w:w="1728"/>
-          </w:tcPr>
-          <w:p>
-            <w:r>
-              <w:t>Name why she keeps circling back, without shame</w:t>
-            </w:r>
-          </w:p>
-        </w:tc>
-        <w:tc>
-          <w:tcPr>
-            <w:tcW w:type="dxa" w:w="1728"/>
-          </w:tcPr>
-          <w:p>
-            <w:r>
-              <w:t>“So it is not just me.”</w:t>
-            </w:r>
-          </w:p>
-        </w:tc>
-        <w:tc>
-          <w:tcPr>
-            <w:tcW w:type="dxa" w:w="1728"/>
-          </w:tcPr>
-          <w:p>
-            <w:r>
-              <w:t>Look at the path</w:t>
-            </w:r>
-          </w:p>
-        </w:tc>
-      </w:tr>
-      <w:tr>
-        <w:tc>
-          <w:tcPr>
-            <w:tcW w:type="dxa" w:w="1728"/>
-          </w:tcPr>
-          <w:p>
-            <w:r>
-              <w:t>4</w:t>
-            </w:r>
-          </w:p>
-        </w:tc>
-        <w:tc>
-          <w:tcPr>
-            <w:tcW w:type="dxa" w:w="1728"/>
-          </w:tcPr>
-          <w:p>
-            <w:r>
-              <w:t>The Anchor Method</w:t>
-            </w:r>
-          </w:p>
-        </w:tc>
-        <w:tc>
-          <w:tcPr>
-            <w:tcW w:type="dxa" w:w="1728"/>
-          </w:tcPr>
-          <w:p>
-            <w:r>
-              <w:t>Show a clear four step path</w:t>
-            </w:r>
-          </w:p>
-        </w:tc>
-        <w:tc>
-          <w:tcPr>
-            <w:tcW w:type="dxa" w:w="1728"/>
-          </w:tcPr>
-          <w:p>
-            <w:r>
-              <w:t>“There is a way out of this.”</w:t>
-            </w:r>
-          </w:p>
-        </w:tc>
-        <w:tc>
-          <w:tcPr>
-            <w:tcW w:type="dxa" w:w="1728"/>
-          </w:tcPr>
-          <w:p>
-            <w:r>
-              <w:t>Start With Step One: Get the Free Guide</w:t>
-            </w:r>
-          </w:p>
-        </w:tc>
-      </w:tr>
-      <w:tr>
-        <w:tc>
-          <w:tcPr>
-            <w:tcW w:type="dxa" w:w="1728"/>
-          </w:tcPr>
-          <w:p>
-            <w:r>
-              <w:t>5</w:t>
-            </w:r>
-          </w:p>
-        </w:tc>
-        <w:tc>
-          <w:tcPr>
-            <w:tcW w:type="dxa" w:w="1728"/>
-          </w:tcPr>
-          <w:p>
-            <w:r>
-              <w:t>Your First Step preview</w:t>
-            </w:r>
-          </w:p>
-        </w:tc>
-        <w:tc>
-          <w:tcPr>
-            <w:tcW w:type="dxa" w:w="1728"/>
-          </w:tcPr>
-          <w:p>
-            <w:r>
-              <w:t>Show that the first step takes ten minutes</w:t>
-            </w:r>
-          </w:p>
-        </w:tc>
-        <w:tc>
-          <w:tcPr>
-            <w:tcW w:type="dxa" w:w="1728"/>
-          </w:tcPr>
-          <w:p>
-            <w:r>
-              <w:t>“I could actually do this.”</w:t>
-            </w:r>
-          </w:p>
-        </w:tc>
-        <w:tc>
-          <w:tcPr>
-            <w:tcW w:type="dxa" w:w="1728"/>
-          </w:tcPr>
-          <w:p>
-            <w:r>
-              <w:t>Send Me the Guide</w:t>
-            </w:r>
-          </w:p>
-        </w:tc>
-      </w:tr>
-      <w:tr>
-        <w:tc>
-          <w:tcPr>
-            <w:tcW w:type="dxa" w:w="1728"/>
-          </w:tcPr>
-          <w:p>
-            <w:r>
-              <w:t>6</w:t>
-            </w:r>
-          </w:p>
-        </w:tc>
-        <w:tc>
-          <w:tcPr>
-            <w:tcW w:type="dxa" w:w="1728"/>
-          </w:tcPr>
-          <w:p>
-            <w:r>
-              <w:t>Your Next Step teaser</w:t>
-            </w:r>
-          </w:p>
-        </w:tc>
-        <w:tc>
-          <w:tcPr>
-            <w:tcW w:type="dxa" w:w="1728"/>
-          </w:tcPr>
-          <w:p>
-            <w:r>
-              <w:t>Offer more to the woman ready for one on one help</w:t>
-            </w:r>
-          </w:p>
-        </w:tc>
-        <w:tc>
-          <w:tcPr>
-            <w:tcW w:type="dxa" w:w="1728"/>
-          </w:tcPr>
-          <w:p>
-            <w:r>
-              <w:t>“I want help now, not just a guide.”</w:t>
-            </w:r>
-          </w:p>
-        </w:tc>
-        <w:tc>
-          <w:tcPr>
-            <w:tcW w:type="dxa" w:w="1728"/>
-          </w:tcPr>
-          <w:p>
-            <w:r>
-              <w:t>Go to /your-next-step</w:t>
-            </w:r>
-          </w:p>
-        </w:tc>
-      </w:tr>
-      <w:tr>
-        <w:tc>
-          <w:tcPr>
-            <w:tcW w:type="dxa" w:w="1728"/>
-          </w:tcPr>
-          <w:p>
-            <w:r>
-              <w:t>7</w:t>
-            </w:r>
-          </w:p>
-        </w:tc>
-        <w:tc>
-          <w:tcPr>
-            <w:tcW w:type="dxa" w:w="1728"/>
-          </w:tcPr>
-          <w:p>
-            <w:r>
-              <w:t>About teaser</w:t>
+              <w:t>About</w:t>
             </w:r>
           </w:p>
         </w:tc>
@@ -888,7 +680,7 @@
           </w:tcPr>
           <w:p>
             <w:r>
-              <w:t>Read Nechelle’s story (About)</w:t>
+              <w:t>Read my story</w:t>
             </w:r>
           </w:p>
         </w:tc>
@@ -900,7 +692,7 @@
           </w:tcPr>
           <w:p>
             <w:r>
-              <w:t>8</w:t>
+              <w:t>4</w:t>
             </w:r>
           </w:p>
         </w:tc>
@@ -910,7 +702,7 @@
           </w:tcPr>
           <w:p>
             <w:r>
-              <w:t>Community invitation</w:t>
+              <w:t>Ways to Work With Me</w:t>
             </w:r>
           </w:p>
         </w:tc>
@@ -920,7 +712,7 @@
           </w:tcPr>
           <w:p>
             <w:r>
-              <w:t>Show where she will not be alone</w:t>
+              <w:t>Show the three offers in one glance</w:t>
             </w:r>
           </w:p>
         </w:tc>
@@ -930,7 +722,7 @@
           </w:tcPr>
           <w:p>
             <w:r>
-              <w:t>“I do not want to do this alone.”</w:t>
+              <w:t>“What can I actually do here?”</w:t>
             </w:r>
           </w:p>
         </w:tc>
@@ -940,7 +732,7 @@
           </w:tcPr>
           <w:p>
             <w:r>
-              <w:t>Join People of Valor Free</w:t>
+              <w:t>Guide, Your Next Step, or People of Valor</w:t>
             </w:r>
           </w:p>
         </w:tc>
@@ -952,7 +744,7 @@
           </w:tcPr>
           <w:p>
             <w:r>
-              <w:t>9</w:t>
+              <w:t>5</w:t>
             </w:r>
           </w:p>
         </w:tc>
@@ -962,7 +754,7 @@
           </w:tcPr>
           <w:p>
             <w:r>
-              <w:t>Final call to action</w:t>
+              <w:t>Guide signup</w:t>
             </w:r>
           </w:p>
         </w:tc>
@@ -972,7 +764,7 @@
           </w:tcPr>
           <w:p>
             <w:r>
-              <w:t>Close with the one ask</w:t>
+              <w:t>Capture the email</w:t>
             </w:r>
           </w:p>
         </w:tc>
@@ -982,7 +774,7 @@
           </w:tcPr>
           <w:p>
             <w:r>
-              <w:t>“Okay. I will take the first step.”</w:t>
+              <w:t>“I will take the first step.”</w:t>
             </w:r>
           </w:p>
         </w:tc>
@@ -1004,7 +796,7 @@
           </w:tcPr>
           <w:p>
             <w:r>
-              <w:t>10</w:t>
+              <w:t>6</w:t>
             </w:r>
           </w:p>
         </w:tc>
@@ -1049,6 +841,58 @@
           </w:p>
         </w:tc>
       </w:tr>
+      <w:tr>
+        <w:tc>
+          <w:tcPr>
+            <w:tcW w:type="dxa" w:w="1728"/>
+          </w:tcPr>
+          <w:p>
+            <w:r>
+              <w:t>Pop up</w:t>
+            </w:r>
+          </w:p>
+        </w:tc>
+        <w:tc>
+          <w:tcPr>
+            <w:tcW w:type="dxa" w:w="1728"/>
+          </w:tcPr>
+          <w:p>
+            <w:r>
+              <w:t>Guide pop up</w:t>
+            </w:r>
+          </w:p>
+        </w:tc>
+        <w:tc>
+          <w:tcPr>
+            <w:tcW w:type="dxa" w:w="1728"/>
+          </w:tcPr>
+          <w:p>
+            <w:r>
+              <w:t>Catch the visitor who will not scroll to the end</w:t>
+            </w:r>
+          </w:p>
+        </w:tc>
+        <w:tc>
+          <w:tcPr>
+            <w:tcW w:type="dxa" w:w="1728"/>
+          </w:tcPr>
+          <w:p>
+            <w:r>
+              <w:t>“I was about to leave.”</w:t>
+            </w:r>
+          </w:p>
+        </w:tc>
+        <w:tc>
+          <w:tcPr>
+            <w:tcW w:type="dxa" w:w="1728"/>
+          </w:tcPr>
+          <w:p>
+            <w:r>
+              <w:t>Send Me the Guide</w:t>
+            </w:r>
+          </w:p>
+        </w:tc>
+      </w:tr>
     </w:tbl>
     <w:p/>
     <w:p>
@@ -1070,7 +914,7 @@
         <w:rPr>
           <w:color w:val="8F7166"/>
         </w:rPr>
-        <w:t>Section 1: Hero with Opt In</w:t>
+        <w:t>Section 1: Hero</w:t>
       </w:r>
     </w:p>
     <w:p>
@@ -1079,10 +923,10 @@
           <w:b/>
           <w:color w:val="5E4B42"/>
         </w:rPr>
-        <w:t xml:space="preserve">Label [new]  </w:t>
+        <w:t xml:space="preserve">Title line [approved]  </w:t>
       </w:r>
       <w:r>
-        <w:t>FOR THE WOMAN AT THE END OF A CHAPTER</w:t>
+        <w:t>Empowerment Strategist · Certified Life Coach · Founder of People of Valor</w:t>
       </w:r>
     </w:p>
     <w:p>
@@ -1115,10 +959,10 @@
           <w:b/>
           <w:color w:val="5E4B42"/>
         </w:rPr>
-        <w:t xml:space="preserve">Opt in lead [approved]  </w:t>
+        <w:t xml:space="preserve">Line [approved]  </w:t>
       </w:r>
       <w:r>
-        <w:t>Now What? The First Step Into Your Next Chapter. Free. Ten minutes.</w:t>
+        <w:t>I help women who carry everyone take the next step with clarity, community, and accountability.</w:t>
       </w:r>
     </w:p>
     <w:p>
@@ -1127,43 +971,10 @@
           <w:b/>
           <w:color w:val="5E4B42"/>
         </w:rPr>
-        <w:t xml:space="preserve">Form  </w:t>
+        <w:t xml:space="preserve">Button  </w:t>
       </w:r>
       <w:r>
-        <w:t>First name, Email</w:t>
-      </w:r>
-    </w:p>
-    <w:p>
-      <w:r>
-        <w:rPr>
-          <w:b/>
-          <w:color w:val="5E4B42"/>
-        </w:rPr>
-        <w:t xml:space="preserve">Button [approved]  </w:t>
-      </w:r>
-      <w:r>
-        <w:t>Send Me the Guide</w:t>
-      </w:r>
-    </w:p>
-    <w:p>
-      <w:r>
-        <w:rPr>
-          <w:b/>
-          <w:color w:val="5E4B42"/>
-        </w:rPr>
-        <w:t xml:space="preserve">Below form [new]  </w:t>
-      </w:r>
-      <w:r>
-        <w:t>Your guide arrives by email. Unsubscribe anytime. Privacy Policy</w:t>
-      </w:r>
-    </w:p>
-    <w:p>
-      <w:r>
-        <w:rPr>
-          <w:i/>
-          <w:color w:val="5E4B42"/>
-        </w:rPr>
-        <w:t>Phone: label, headline, subhead, form, and button all sit in the first screen. Your photo moves below the form on phones and sits beside it on desktop.</w:t>
+        <w:t>Get the Free Guide (scrolls to the signup at the end of the page)</w:t>
       </w:r>
     </w:p>
     <w:p>
@@ -1195,22 +1006,10 @@
           <w:b/>
           <w:color w:val="5E4B42"/>
         </w:rPr>
-        <w:t xml:space="preserve">Body [approved]  </w:t>
+        <w:t xml:space="preserve">Body [approved, shortened]  </w:t>
       </w:r>
       <w:r>
-        <w:t>You healed the trauma. You left the relationship. The kids moved out. The friendship ended.</w:t>
-      </w:r>
-    </w:p>
-    <w:p>
-      <w:r>
-        <w:rPr>
-          <w:b/>
-          <w:color w:val="5E4B42"/>
-        </w:rPr>
-        <w:t xml:space="preserve">  </w:t>
-      </w:r>
-      <w:r>
-        <w:t>From the outside, you are successful, respected, and the one everyone counts on. On the inside, the same question keeps surfacing. And staying where you are feels safer than stepping into what you cannot yet see.</w:t>
+        <w:t>From the outside, you are successful, respected, and the one everyone counts on. On the inside, the same question keeps surfacing.</w:t>
       </w:r>
     </w:p>
     <w:p>
@@ -1233,7 +1032,75 @@
         <w:rPr>
           <w:color w:val="8F7166"/>
         </w:rPr>
-        <w:t>Section 3: The Loop</w:t>
+        <w:t>Ways to Work With Me [new]</w:t>
+      </w:r>
+    </w:p>
+    <w:p>
+      <w:r>
+        <w:rPr>
+          <w:b/>
+          <w:color w:val="5E4B42"/>
+        </w:rPr>
+        <w:t xml:space="preserve">The Free Guide  </w:t>
+      </w:r>
+      <w:r>
+        <w:t>Now What? The First Step Into Your Next Chapter. Ten minutes. One honest step. Button: Get the Free Guide.</w:t>
+      </w:r>
+    </w:p>
+    <w:p>
+      <w:r>
+        <w:rPr>
+          <w:b/>
+          <w:color w:val="5E4B42"/>
+        </w:rPr>
+        <w:t xml:space="preserve">Your Next Step  </w:t>
+      </w:r>
+      <w:r>
+        <w:t>A 60-minute private coaching session on Zoom. Leave with one priority, one practical boundary, and a seven-day plan. Button: Book Your Next Step (to /your-next-step).</w:t>
+      </w:r>
+    </w:p>
+    <w:p>
+      <w:r>
+        <w:rPr>
+          <w:b/>
+          <w:color w:val="5E4B42"/>
+        </w:rPr>
+        <w:t xml:space="preserve">People of Valor  </w:t>
+      </w:r>
+      <w:r>
+        <w:t>A free community on Skool where people hold each other to the next step. Every Monday, we pray together. Button: Join People of Valor Free.</w:t>
+      </w:r>
+    </w:p>
+    <w:p>
+      <w:r>
+        <w:rPr>
+          <w:i/>
+          <w:color w:val="5E4B42"/>
+        </w:rPr>
+        <w:t>This replaces the standalone Your Next Step teaser and Community sections below, which now live in the paste kit as these three cards. The Anchor Method and Your First Step are not on the website; they stay inside the guide and the welcome emails.</w:t>
+      </w:r>
+    </w:p>
+    <w:p>
+      <w:pPr>
+        <w:pStyle w:val="Heading3"/>
+      </w:pPr>
+      <w:r>
+        <w:rPr>
+          <w:color w:val="8F7166"/>
+        </w:rPr>
+        <w:t>Guide Pop Up</w:t>
+      </w:r>
+    </w:p>
+    <w:p>
+      <w:r>
+        <w:rPr>
+          <w:b/>
+          <w:color w:val="5E4B42"/>
+        </w:rPr>
+        <w:t xml:space="preserve">Label  </w:t>
+      </w:r>
+      <w:r>
+        <w:t>FREE GUIDE</w:t>
       </w:r>
     </w:p>
     <w:p>
@@ -1245,7 +1112,7 @@
         <w:t xml:space="preserve">Headline [approved]  </w:t>
       </w:r>
       <w:r>
-        <w:t>Why You Keep Circling Back</w:t>
+        <w:t>You Did the Hard Part. Now What?</w:t>
       </w:r>
     </w:p>
     <w:p>
@@ -1254,10 +1121,10 @@
           <w:b/>
           <w:color w:val="5E4B42"/>
         </w:rPr>
-        <w:t xml:space="preserve">Body [approved]  </w:t>
+        <w:t xml:space="preserve">Body [approved phrases]  </w:t>
       </w:r>
       <w:r>
-        <w:t>You know something needs to change. So why haven’t you moved?</w:t>
+        <w:t>Get Now What? The First Step Into Your Next Chapter. Ten minutes. One honest step.</w:t>
       </w:r>
     </w:p>
     <w:p>
@@ -1266,10 +1133,10 @@
           <w:b/>
           <w:color w:val="5E4B42"/>
         </w:rPr>
-        <w:t xml:space="preserve">  </w:t>
+        <w:t xml:space="preserve">Form  </w:t>
       </w:r>
       <w:r>
-        <w:t>Because staying the same requires nothing of you. It is familiar. You know how to perform it. The next chapter asks you to step into something you cannot yet see, and the unknown often feels more dangerous than the place you are stuck in.</w:t>
+        <w:t>First name, Email. Button: Send Me the Guide. Tag: Source Popup.</w:t>
       </w:r>
     </w:p>
     <w:p>
@@ -1278,218 +1145,10 @@
           <w:b/>
           <w:color w:val="5E4B42"/>
         </w:rPr>
-        <w:t xml:space="preserve">  </w:t>
+        <w:t xml:space="preserve">Timing  </w:t>
       </w:r>
       <w:r>
-        <w:t>So you circle back. You fill the open calendar. You say “I’m fine.” You return to the role you have outgrown, because at least you know the lines.</w:t>
-      </w:r>
-    </w:p>
-    <w:p>
-      <w:r>
-        <w:rPr>
-          <w:b/>
-          <w:color w:val="5E4B42"/>
-        </w:rPr>
-        <w:t xml:space="preserve">  </w:t>
-      </w:r>
-      <w:r>
-        <w:t>This is not a flaw in you. It is a loop. And it breaks the way every loop breaks: not with more information, but with one clear step, taken alongside people who will not let you go back.</w:t>
-      </w:r>
-    </w:p>
-    <w:p>
-      <w:pPr>
-        <w:pStyle w:val="Heading3"/>
-      </w:pPr>
-      <w:r>
-        <w:rPr>
-          <w:color w:val="8F7166"/>
-        </w:rPr>
-        <w:t>Section 4: The Anchor Method</w:t>
-      </w:r>
-    </w:p>
-    <w:p>
-      <w:r>
-        <w:rPr>
-          <w:b/>
-          <w:color w:val="5E4B42"/>
-        </w:rPr>
-        <w:t xml:space="preserve">Headline [approved]  </w:t>
-      </w:r>
-      <w:r>
-        <w:t>The Anchor Method™</w:t>
-      </w:r>
-    </w:p>
-    <w:p>
-      <w:r>
-        <w:rPr>
-          <w:b/>
-          <w:color w:val="5E4B42"/>
-        </w:rPr>
-        <w:t xml:space="preserve">Lead [approved]  </w:t>
-      </w:r>
-      <w:r>
-        <w:t>An anchor does not stop the waves. It keeps you from drifting while they pass.</w:t>
-      </w:r>
-    </w:p>
-    <w:p>
-      <w:r>
-        <w:rPr>
-          <w:b/>
-          <w:color w:val="5E4B42"/>
-        </w:rPr>
-        <w:t xml:space="preserve">1. Stop Faking [approved]  </w:t>
-      </w:r>
-      <w:r>
-        <w:t>Tell the truth about where you really are.</w:t>
-      </w:r>
-    </w:p>
-    <w:p>
-      <w:r>
-        <w:rPr>
-          <w:b/>
-          <w:color w:val="5E4B42"/>
-        </w:rPr>
-        <w:t xml:space="preserve">2. Return to Sender [approved]  </w:t>
-      </w:r>
-      <w:r>
-        <w:t>Hand back what was never yours to carry.</w:t>
-      </w:r>
-    </w:p>
-    <w:p>
-      <w:r>
-        <w:rPr>
-          <w:b/>
-          <w:color w:val="5E4B42"/>
-        </w:rPr>
-        <w:t xml:space="preserve">3. Rebuild Me [approved]  </w:t>
-      </w:r>
-      <w:r>
-        <w:t>Recover the woman underneath the roles.</w:t>
-      </w:r>
-    </w:p>
-    <w:p>
-      <w:r>
-        <w:rPr>
-          <w:b/>
-          <w:color w:val="5E4B42"/>
-        </w:rPr>
-        <w:t xml:space="preserve">4. Take Ground [approved]  </w:t>
-      </w:r>
-      <w:r>
-        <w:t>Build something with your name on it.</w:t>
-      </w:r>
-    </w:p>
-    <w:p>
-      <w:r>
-        <w:rPr>
-          <w:b/>
-          <w:color w:val="5E4B42"/>
-        </w:rPr>
-        <w:t xml:space="preserve">Close [approved]  </w:t>
-      </w:r>
-      <w:r>
-        <w:t>Every step begins with the first one. So let’s take it.</w:t>
-      </w:r>
-    </w:p>
-    <w:p>
-      <w:r>
-        <w:rPr>
-          <w:b/>
-          <w:color w:val="5E4B42"/>
-        </w:rPr>
-        <w:t xml:space="preserve">Button [approved]  </w:t>
-      </w:r>
-      <w:r>
-        <w:t>Start With Step One: Get the Free Guide (scrolls to the Section 9 form)</w:t>
-      </w:r>
-    </w:p>
-    <w:p>
-      <w:r>
-        <w:rPr>
-          <w:i/>
-          <w:color w:val="5E4B42"/>
-        </w:rPr>
-        <w:t>Step lines use the shorter homepage versions, so each card reads in one glance on a phone. The fuller versions stay in the guide.</w:t>
-      </w:r>
-    </w:p>
-    <w:p>
-      <w:pPr>
-        <w:pStyle w:val="Heading3"/>
-      </w:pPr>
-      <w:r>
-        <w:rPr>
-          <w:color w:val="8F7166"/>
-        </w:rPr>
-        <w:t>Section 5: Your First Step Preview</w:t>
-      </w:r>
-    </w:p>
-    <w:p>
-      <w:r>
-        <w:rPr>
-          <w:b/>
-          <w:color w:val="5E4B42"/>
-        </w:rPr>
-        <w:t xml:space="preserve">Headline [approved]  </w:t>
-      </w:r>
-      <w:r>
-        <w:t>Your First Step</w:t>
-      </w:r>
-    </w:p>
-    <w:p>
-      <w:r>
-        <w:rPr>
-          <w:b/>
-          <w:color w:val="5E4B42"/>
-        </w:rPr>
-        <w:t xml:space="preserve">Lead [approved]  </w:t>
-      </w:r>
-      <w:r>
-        <w:t>Find a quiet place. Put your phone face down. Take ten minutes that belong only to you.</w:t>
-      </w:r>
-    </w:p>
-    <w:p>
-      <w:r>
-        <w:rPr>
-          <w:b/>
-          <w:color w:val="5E4B42"/>
-        </w:rPr>
-        <w:t xml:space="preserve">Three cards [approved titles]  </w:t>
-      </w:r>
-      <w:r>
-        <w:t>Part One: Tell the truth.  Part Two: Say it to God.  Part Three: Name one person.</w:t>
-      </w:r>
-    </w:p>
-    <w:p>
-      <w:r>
-        <w:rPr>
-          <w:b/>
-          <w:color w:val="5E4B42"/>
-        </w:rPr>
-        <w:t xml:space="preserve">Under cards [approved]  </w:t>
-      </w:r>
-      <w:r>
-        <w:t>The first step most women spend years avoiding.</w:t>
-      </w:r>
-    </w:p>
-    <w:p>
-      <w:r>
-        <w:rPr>
-          <w:b/>
-          <w:color w:val="5E4B42"/>
-        </w:rPr>
-        <w:t xml:space="preserve">Button [approved]  </w:t>
-      </w:r>
-      <w:r>
-        <w:t>Send Me the Guide (scrolls to the Section 9 form)</w:t>
-      </w:r>
-    </w:p>
-    <w:p>
-      <w:r>
-        <w:rPr>
-          <w:i/>
-          <w:color w:val="5E4B42"/>
-        </w:rPr>
-        <w:t>Show the titles only. The full exercise stays in the guide so the opt in keeps its value.</w:t>
+        <w:t>Once per visitor, after about 20 seconds or on exit. Homepage only.</w:t>
       </w:r>
     </w:p>
     <w:p>
@@ -1926,10 +1585,10 @@
           <w:b/>
           <w:color w:val="5E4B42"/>
         </w:rPr>
-        <w:t xml:space="preserve">1. Watch your inbox. [approved]  </w:t>
+        <w:t xml:space="preserve">1. Watch your inbox.  </w:t>
       </w:r>
       <w:r>
-        <w:t>Over the next few days, I will walk you through each step of the Anchor Method, one email at a time.</w:t>
+        <w:t>Over the next few days, I will walk you through your next steps, one email at a time.</w:t>
       </w:r>
     </w:p>
     <w:p>
@@ -2707,7 +2366,7 @@
           </w:tcPr>
           <w:p>
             <w:r>
-              <w:t>Get the Free Guide</w:t>
+              <w:t>Free Guide</w:t>
             </w:r>
           </w:p>
         </w:tc>
@@ -2717,7 +2376,7 @@
           </w:tcPr>
           <w:p>
             <w:r>
-              <w:t>Scroll to hero form</w:t>
+              <w:t>Scroll to the guide signup</w:t>
             </w:r>
           </w:p>
         </w:tc>
@@ -2749,7 +2408,7 @@
           </w:tcPr>
           <w:p>
             <w:r>
-              <w:t>Label, H1, subhead, opt in lead, form, microcopy, photo</w:t>
+              <w:t>Title line, H1, subhead, line, button</w:t>
             </w:r>
           </w:p>
         </w:tc>
@@ -2759,7 +2418,7 @@
           </w:tcPr>
           <w:p>
             <w:r>
-              <w:t>Send Me the Guide</w:t>
+              <w:t>Get the Free Guide</w:t>
             </w:r>
           </w:p>
         </w:tc>
@@ -2769,7 +2428,7 @@
           </w:tcPr>
           <w:p>
             <w:r>
-              <w:t>Form submit</w:t>
+              <w:t>Scroll to the guide signup</w:t>
             </w:r>
           </w:p>
         </w:tc>
@@ -2801,7 +2460,7 @@
           </w:tcPr>
           <w:p>
             <w:r>
-              <w:t>H2, three paragraphs</w:t>
+              <w:t>H2, two paragraphs</w:t>
             </w:r>
           </w:p>
         </w:tc>
@@ -2833,7 +2492,7 @@
           </w:tcPr>
           <w:p>
             <w:r>
-              <w:t>3 The Loop</w:t>
+              <w:t>3 About</w:t>
             </w:r>
           </w:p>
         </w:tc>
@@ -2853,215 +2512,7 @@
           </w:tcPr>
           <w:p>
             <w:r>
-              <w:t>H2, four paragraphs</w:t>
-            </w:r>
-          </w:p>
-        </w:tc>
-        <w:tc>
-          <w:tcPr>
-            <w:tcW w:type="dxa" w:w="1728"/>
-          </w:tcPr>
-          <w:p>
-            <w:r>
-              <w:t>None</w:t>
-            </w:r>
-          </w:p>
-        </w:tc>
-        <w:tc>
-          <w:tcPr>
-            <w:tcW w:type="dxa" w:w="1728"/>
-          </w:tcPr>
-          <w:p>
-            <w:r>
-              <w:t>None</w:t>
-            </w:r>
-          </w:p>
-        </w:tc>
-      </w:tr>
-      <w:tr>
-        <w:tc>
-          <w:tcPr>
-            <w:tcW w:type="dxa" w:w="1728"/>
-          </w:tcPr>
-          <w:p>
-            <w:r>
-              <w:t>4 Anchor Method</w:t>
-            </w:r>
-          </w:p>
-        </w:tc>
-        <w:tc>
-          <w:tcPr>
-            <w:tcW w:type="dxa" w:w="1728"/>
-          </w:tcPr>
-          <w:p>
-            <w:r>
-              <w:t>White cards on soft blush beige</w:t>
-            </w:r>
-          </w:p>
-        </w:tc>
-        <w:tc>
-          <w:tcPr>
-            <w:tcW w:type="dxa" w:w="1728"/>
-          </w:tcPr>
-          <w:p>
-            <w:r>
-              <w:t>H2, lead line, four step cards, close line, button</w:t>
-            </w:r>
-          </w:p>
-        </w:tc>
-        <w:tc>
-          <w:tcPr>
-            <w:tcW w:type="dxa" w:w="1728"/>
-          </w:tcPr>
-          <w:p>
-            <w:r>
-              <w:t>Start With Step One: Get the Free Guide</w:t>
-            </w:r>
-          </w:p>
-        </w:tc>
-        <w:tc>
-          <w:tcPr>
-            <w:tcW w:type="dxa" w:w="1728"/>
-          </w:tcPr>
-          <w:p>
-            <w:r>
-              <w:t>Scroll to Section 9 form</w:t>
-            </w:r>
-          </w:p>
-        </w:tc>
-      </w:tr>
-      <w:tr>
-        <w:tc>
-          <w:tcPr>
-            <w:tcW w:type="dxa" w:w="1728"/>
-          </w:tcPr>
-          <w:p>
-            <w:r>
-              <w:t>5 First Step</w:t>
-            </w:r>
-          </w:p>
-        </w:tc>
-        <w:tc>
-          <w:tcPr>
-            <w:tcW w:type="dxa" w:w="1728"/>
-          </w:tcPr>
-          <w:p>
-            <w:r>
-              <w:t>Dusty rose</w:t>
-            </w:r>
-          </w:p>
-        </w:tc>
-        <w:tc>
-          <w:tcPr>
-            <w:tcW w:type="dxa" w:w="1728"/>
-          </w:tcPr>
-          <w:p>
-            <w:r>
-              <w:t>H2, lead, three cards, line, button</w:t>
-            </w:r>
-          </w:p>
-        </w:tc>
-        <w:tc>
-          <w:tcPr>
-            <w:tcW w:type="dxa" w:w="1728"/>
-          </w:tcPr>
-          <w:p>
-            <w:r>
-              <w:t>Send Me the Guide</w:t>
-            </w:r>
-          </w:p>
-        </w:tc>
-        <w:tc>
-          <w:tcPr>
-            <w:tcW w:type="dxa" w:w="1728"/>
-          </w:tcPr>
-          <w:p>
-            <w:r>
-              <w:t>Scroll to Section 9 form</w:t>
-            </w:r>
-          </w:p>
-        </w:tc>
-      </w:tr>
-      <w:tr>
-        <w:tc>
-          <w:tcPr>
-            <w:tcW w:type="dxa" w:w="1728"/>
-          </w:tcPr>
-          <w:p>
-            <w:r>
-              <w:t>6 Your Next Step</w:t>
-            </w:r>
-          </w:p>
-        </w:tc>
-        <w:tc>
-          <w:tcPr>
-            <w:tcW w:type="dxa" w:w="1728"/>
-          </w:tcPr>
-          <w:p>
-            <w:r>
-              <w:t>White</w:t>
-            </w:r>
-          </w:p>
-        </w:tc>
-        <w:tc>
-          <w:tcPr>
-            <w:tcW w:type="dxa" w:w="1728"/>
-          </w:tcPr>
-          <w:p>
-            <w:r>
-              <w:t>Label, H2, paragraph, button</w:t>
-            </w:r>
-          </w:p>
-        </w:tc>
-        <w:tc>
-          <w:tcPr>
-            <w:tcW w:type="dxa" w:w="1728"/>
-          </w:tcPr>
-          <w:p>
-            <w:r>
-              <w:t>Book Your Next Step</w:t>
-            </w:r>
-          </w:p>
-        </w:tc>
-        <w:tc>
-          <w:tcPr>
-            <w:tcW w:type="dxa" w:w="1728"/>
-          </w:tcPr>
-          <w:p>
-            <w:r>
-              <w:t>/your-next-step</w:t>
-            </w:r>
-          </w:p>
-        </w:tc>
-      </w:tr>
-      <w:tr>
-        <w:tc>
-          <w:tcPr>
-            <w:tcW w:type="dxa" w:w="1728"/>
-          </w:tcPr>
-          <w:p>
-            <w:r>
-              <w:t>7 About teaser</w:t>
-            </w:r>
-          </w:p>
-        </w:tc>
-        <w:tc>
-          <w:tcPr>
-            <w:tcW w:type="dxa" w:w="1728"/>
-          </w:tcPr>
-          <w:p>
-            <w:r>
-              <w:t>Dusty rose</w:t>
-            </w:r>
-          </w:p>
-        </w:tc>
-        <w:tc>
-          <w:tcPr>
-            <w:tcW w:type="dxa" w:w="1728"/>
-          </w:tcPr>
-          <w:p>
-            <w:r>
-              <w:t>Photo, H2, title line, two paragraphs, text link</w:t>
+              <w:t>Photo, H2, title line, two paragraphs, link</w:t>
             </w:r>
           </w:p>
         </w:tc>
@@ -3093,7 +2544,7 @@
           </w:tcPr>
           <w:p>
             <w:r>
-              <w:t>8 Community</w:t>
+              <w:t>4 Ways to Work With Me</w:t>
             </w:r>
           </w:p>
         </w:tc>
@@ -3113,7 +2564,7 @@
           </w:tcPr>
           <w:p>
             <w:r>
-              <w:t>H2, paragraph, secondary button</w:t>
+              <w:t>Three white cards</w:t>
             </w:r>
           </w:p>
         </w:tc>
@@ -3123,7 +2574,7 @@
           </w:tcPr>
           <w:p>
             <w:r>
-              <w:t>Join People of Valor Free</w:t>
+              <w:t>Get the Free Guide / Book Your Next Step / Join People of Valor Free</w:t>
             </w:r>
           </w:p>
         </w:tc>
@@ -3133,7 +2584,7 @@
           </w:tcPr>
           <w:p>
             <w:r>
-              <w:t>Skool link</w:t>
+              <w:t>Signup / /your-next-step / Skool</w:t>
             </w:r>
           </w:p>
         </w:tc>
@@ -3145,7 +2596,7 @@
           </w:tcPr>
           <w:p>
             <w:r>
-              <w:t>9 Final CTA</w:t>
+              <w:t>5 Guide signup</w:t>
             </w:r>
           </w:p>
         </w:tc>
@@ -3165,7 +2616,7 @@
           </w:tcPr>
           <w:p>
             <w:r>
-              <w:t>H2, paragraph, form, microcopy</w:t>
+              <w:t>H2, line, systeme.io form, note</w:t>
             </w:r>
           </w:p>
         </w:tc>
@@ -3217,7 +2668,7 @@
           </w:tcPr>
           <w:p>
             <w:r>
-              <w:t>Brand, title line, links, legal line</w:t>
+              <w:t>Brand, title line, links, devotional, legal line</w:t>
             </w:r>
           </w:p>
         </w:tc>
@@ -3238,6 +2689,58 @@
           <w:p>
             <w:r>
               <w:t>Listed links</w:t>
+            </w:r>
+          </w:p>
+        </w:tc>
+      </w:tr>
+      <w:tr>
+        <w:tc>
+          <w:tcPr>
+            <w:tcW w:type="dxa" w:w="1728"/>
+          </w:tcPr>
+          <w:p>
+            <w:r>
+              <w:t>Pop up</w:t>
+            </w:r>
+          </w:p>
+        </w:tc>
+        <w:tc>
+          <w:tcPr>
+            <w:tcW w:type="dxa" w:w="1728"/>
+          </w:tcPr>
+          <w:p>
+            <w:r>
+              <w:t>White</w:t>
+            </w:r>
+          </w:p>
+        </w:tc>
+        <w:tc>
+          <w:tcPr>
+            <w:tcW w:type="dxa" w:w="1728"/>
+          </w:tcPr>
+          <w:p>
+            <w:r>
+              <w:t>Label, H2, line, systeme.io form, note</w:t>
+            </w:r>
+          </w:p>
+        </w:tc>
+        <w:tc>
+          <w:tcPr>
+            <w:tcW w:type="dxa" w:w="1728"/>
+          </w:tcPr>
+          <w:p>
+            <w:r>
+              <w:t>Send Me the Guide</w:t>
+            </w:r>
+          </w:p>
+        </w:tc>
+        <w:tc>
+          <w:tcPr>
+            <w:tcW w:type="dxa" w:w="1728"/>
+          </w:tcPr>
+          <w:p>
+            <w:r>
+              <w:t>Form submit</w:t>
             </w:r>
           </w:p>
         </w:tc>

</xml_diff>

<commit_message>
Book through embedded Calendly calendar; add 'from a cage' to story
Co-Authored-By: Claude Opus 5.5 <noreply@anthropic.com>
Claude-Session: https://claude.ai/code/session_01QtsEaUnHz7gtTApzgSGYm3
</commit_message>
<xml_diff>
--- a/website/Website Restructure and Build Brief.docx
+++ b/website/Website Restructure and Build Brief.docx
@@ -56,7 +56,7 @@
         <w:pStyle w:val="ListNumber"/>
       </w:pPr>
       <w:r>
-        <w:t>Booking lives on your website. Your Next Step is sold through a systeme.io checkout at /book-your-next-step, followed by a hidden calendar page at /choose-your-time. Full build steps are in Deliverable 2, Section 8.</w:t>
+        <w:t>Booking lives on your website through your Calendly calendar, embedded at /book-your-next-step. Full steps are in Deliverable 2, Section 8.</w:t>
       </w:r>
     </w:p>
     <w:p>
@@ -3057,39 +3057,7 @@
           </w:tcPr>
           <w:p>
             <w:r>
-              <w:t>Checkout, $125 (see Section 8)</w:t>
-            </w:r>
-          </w:p>
-        </w:tc>
-        <w:tc>
-          <w:tcPr>
-            <w:tcW w:type="dxa" w:w="2880"/>
-          </w:tcPr>
-          <w:p>
-            <w:r>
-              <w:t>Noindex</w:t>
-            </w:r>
-          </w:p>
-        </w:tc>
-      </w:tr>
-      <w:tr>
-        <w:tc>
-          <w:tcPr>
-            <w:tcW w:type="dxa" w:w="2880"/>
-          </w:tcPr>
-          <w:p>
-            <w:r>
-              <w:t>/choose-your-time</w:t>
-            </w:r>
-          </w:p>
-        </w:tc>
-        <w:tc>
-          <w:tcPr>
-            <w:tcW w:type="dxa" w:w="2880"/>
-          </w:tcPr>
-          <w:p>
-            <w:r>
-              <w:t>Calendar after payment, unlinked everywhere</w:t>
+              <w:t>Booking page with your Calendly calendar</w:t>
             </w:r>
           </w:p>
         </w:tc>
@@ -4158,7 +4126,7 @@
           </w:tcPr>
           <w:p>
             <w:r>
-              <w:t>Every paid order on /book-your-next-step adds the tag Your Next Step Client. Cross check against the calendar’s booked sessions each week.</w:t>
+              <w:t>Calendly scheduled events for the Your Next Step event, matched to Stripe or PayPal payments.</w:t>
             </w:r>
           </w:p>
         </w:tc>
@@ -4168,7 +4136,7 @@
           </w:tcPr>
           <w:p>
             <w:r>
-              <w:t>systeme.io Sales report for the Your Next Step product, and the tag count.</w:t>
+              <w:t>Calendly and your payment dashboard, weekly.</w:t>
             </w:r>
           </w:p>
         </w:tc>
@@ -4326,7 +4294,7 @@
           </w:tcPr>
           <w:p>
             <w:r>
-              <w:t>1. Opt in pages /now-what, /now-what-tiktok, /now-what-youtube with tagged forms. 2. Thank you page. 3. Welcome sequence live and tested. 4. Bio links updated. 5. Booking funnel on your website (Section 8) tested with one real purchase. 6. Homepage hero replaced with the new headline and opt in form. 7. Remove Book Now, Calendly, More info links, scripture quote, stray text. 8. Footer fixed and copyright 2026.</w:t>
+              <w:t>1. Opt in pages /now-what, /now-what-tiktok, /now-what-youtube with tagged forms. 2. Thank you page. 3. Welcome sequence live and tested. 4. Bio links updated. 5. Booking page with your Calendly calendar (Section 8) tested on your phone. 6. Homepage hero replaced with the new headline and opt in form. 7. Remove Book Now, Calendly, More info links, scripture quote, stray text. 8. Footer fixed and copyright 2026.</w:t>
             </w:r>
           </w:p>
         </w:tc>
@@ -4416,198 +4384,7 @@
           <w:b/>
           <w:i w:val="0"/>
         </w:rPr>
-        <w:t>The full path: homepage teaser or menu, then /your-next-step, then checkout, then the calendar. Nothing links to checkout except the /your-next-step page, and nothing links to the calendar at all.</w:t>
-      </w:r>
-    </w:p>
-    <w:tbl>
-      <w:tblPr>
-        <w:tblStyle w:val="LightGrid-Accent1"/>
-        <w:tblW w:type="auto" w:w="0"/>
-        <w:tblLook w:firstColumn="1" w:firstRow="1" w:lastColumn="0" w:lastRow="0" w:noHBand="0" w:noVBand="1" w:val="04A0"/>
-      </w:tblPr>
-      <w:tblGrid>
-        <w:gridCol w:w="2160"/>
-        <w:gridCol w:w="2160"/>
-        <w:gridCol w:w="2160"/>
-        <w:gridCol w:w="2160"/>
-      </w:tblGrid>
-      <w:tr>
-        <w:tc>
-          <w:tcPr>
-            <w:tcW w:type="dxa" w:w="2160"/>
-          </w:tcPr>
-          <w:p>
-            <w:r>
-              <w:t>Step</w:t>
-            </w:r>
-          </w:p>
-        </w:tc>
-        <w:tc>
-          <w:tcPr>
-            <w:tcW w:type="dxa" w:w="2160"/>
-          </w:tcPr>
-          <w:p>
-            <w:r>
-              <w:t>Path</w:t>
-            </w:r>
-          </w:p>
-        </w:tc>
-        <w:tc>
-          <w:tcPr>
-            <w:tcW w:type="dxa" w:w="2160"/>
-          </w:tcPr>
-          <w:p>
-            <w:r>
-              <w:t>What it is</w:t>
-            </w:r>
-          </w:p>
-        </w:tc>
-        <w:tc>
-          <w:tcPr>
-            <w:tcW w:type="dxa" w:w="2160"/>
-          </w:tcPr>
-          <w:p>
-            <w:r>
-              <w:t>Search engines</w:t>
-            </w:r>
-          </w:p>
-        </w:tc>
-      </w:tr>
-      <w:tr>
-        <w:tc>
-          <w:tcPr>
-            <w:tcW w:type="dxa" w:w="2160"/>
-          </w:tcPr>
-          <w:p>
-            <w:r>
-              <w:t>1</w:t>
-            </w:r>
-          </w:p>
-        </w:tc>
-        <w:tc>
-          <w:tcPr>
-            <w:tcW w:type="dxa" w:w="2160"/>
-          </w:tcPr>
-          <w:p>
-            <w:r>
-              <w:t>/your-next-step</w:t>
-            </w:r>
-          </w:p>
-        </w:tc>
-        <w:tc>
-          <w:tcPr>
-            <w:tcW w:type="dxa" w:w="2160"/>
-          </w:tcPr>
-          <w:p>
-            <w:r>
-              <w:t>Approved landing page. All three buttons link to /book-your-next-step.</w:t>
-            </w:r>
-          </w:p>
-        </w:tc>
-        <w:tc>
-          <w:tcPr>
-            <w:tcW w:type="dxa" w:w="2160"/>
-          </w:tcPr>
-          <w:p>
-            <w:r>
-              <w:t>Indexed</w:t>
-            </w:r>
-          </w:p>
-        </w:tc>
-      </w:tr>
-      <w:tr>
-        <w:tc>
-          <w:tcPr>
-            <w:tcW w:type="dxa" w:w="2160"/>
-          </w:tcPr>
-          <w:p>
-            <w:r>
-              <w:t>2</w:t>
-            </w:r>
-          </w:p>
-        </w:tc>
-        <w:tc>
-          <w:tcPr>
-            <w:tcW w:type="dxa" w:w="2160"/>
-          </w:tcPr>
-          <w:p>
-            <w:r>
-              <w:t>/book-your-next-step</w:t>
-            </w:r>
-          </w:p>
-        </w:tc>
-        <w:tc>
-          <w:tcPr>
-            <w:tcW w:type="dxa" w:w="2160"/>
-          </w:tcPr>
-          <w:p>
-            <w:r>
-              <w:t>systeme.io order form: product Your Next Step: 60-Minute Private Coaching Session, $125 one time, Stripe and PayPal on.</w:t>
-            </w:r>
-          </w:p>
-        </w:tc>
-        <w:tc>
-          <w:tcPr>
-            <w:tcW w:type="dxa" w:w="2160"/>
-          </w:tcPr>
-          <w:p>
-            <w:r>
-              <w:t>Noindex</w:t>
-            </w:r>
-          </w:p>
-        </w:tc>
-      </w:tr>
-      <w:tr>
-        <w:tc>
-          <w:tcPr>
-            <w:tcW w:type="dxa" w:w="2160"/>
-          </w:tcPr>
-          <w:p>
-            <w:r>
-              <w:t>3</w:t>
-            </w:r>
-          </w:p>
-        </w:tc>
-        <w:tc>
-          <w:tcPr>
-            <w:tcW w:type="dxa" w:w="2160"/>
-          </w:tcPr>
-          <w:p>
-            <w:r>
-              <w:t>/choose-your-time</w:t>
-            </w:r>
-          </w:p>
-        </w:tc>
-        <w:tc>
-          <w:tcPr>
-            <w:tcW w:type="dxa" w:w="2160"/>
-          </w:tcPr>
-          <w:p>
-            <w:r>
-              <w:t>Thank you step after payment with the systeme.io calendar element for the Your Next Step event.</w:t>
-            </w:r>
-          </w:p>
-        </w:tc>
-        <w:tc>
-          <w:tcPr>
-            <w:tcW w:type="dxa" w:w="2160"/>
-          </w:tcPr>
-          <w:p>
-            <w:r>
-              <w:t>Noindex, never linked</w:t>
-            </w:r>
-          </w:p>
-        </w:tc>
-      </w:tr>
-    </w:tbl>
-    <w:p/>
-    <w:p>
-      <w:r>
-        <w:rPr>
-          <w:b/>
-          <w:i w:val="0"/>
-        </w:rPr>
-        <w:t>Setup in systeme.io:</w:t>
+        <w:t>Booking runs on your Calendly calendar, shown inside your website. Homepage teaser or menu, then /your-next-step, then /book-your-next-step with the Calendly calendar embedded. Calendly handles the time, the $125 payment through Stripe or PayPal, the Zoom link, and the confirmation email.</w:t>
       </w:r>
     </w:p>
     <w:p>
@@ -4615,7 +4392,7 @@
         <w:pStyle w:val="ListNumber"/>
       </w:pPr>
       <w:r>
-        <w:t>Settings: connect Stripe and PayPal as payment gateways.</w:t>
+        <w:t>Calendly event Your Next Step: 60 minutes, $125, Zoom location, Terms link on the booking form.</w:t>
       </w:r>
     </w:p>
     <w:p>
@@ -4623,7 +4400,7 @@
         <w:pStyle w:val="ListNumber"/>
       </w:pPr>
       <w:r>
-        <w:t>Calendar: create the event Your Next Step, 60 minutes, your availability, your Zoom meeting link as the location so it appears in the confirmation email.</w:t>
+        <w:t>Page /book-your-next-step: paste the Book page code from the website paste kit. Noindex.</w:t>
       </w:r>
     </w:p>
     <w:p>
@@ -4631,7 +4408,7 @@
         <w:pStyle w:val="ListNumber"/>
       </w:pPr>
       <w:r>
-        <w:t>Create a funnel named Your Next Step with the three steps above, in that order. Paste the Your Next Step landing page code into step 1 (from the paste kit).</w:t>
+        <w:t>The three Book Your Next Step buttons on /your-next-step link to /book-your-next-step.</w:t>
       </w:r>
     </w:p>
     <w:p>
@@ -4639,202 +4416,7 @@
         <w:pStyle w:val="ListNumber"/>
       </w:pPr>
       <w:r>
-        <w:t>Order form: add a required checkbox: “I have read and agree to the Terms, including the 24-hour rescheduling policy and that payments are non-refundable.” Link the word Terms to /terms.</w:t>
-      </w:r>
-    </w:p>
-    <w:p>
-      <w:pPr>
-        <w:pStyle w:val="ListNumber"/>
-      </w:pPr>
-      <w:r>
-        <w:t>Order form automation: add tag Your Next Step Client on purchase.</w:t>
-      </w:r>
-    </w:p>
-    <w:p>
-      <w:pPr>
-        <w:pStyle w:val="ListNumber"/>
-      </w:pPr>
-      <w:r>
-        <w:t>Change the three Book Your Next Step buttons on the landing page from the Calendly link to /book-your-next-step. Then turn off the Calendly event so there is only one way to book.</w:t>
-      </w:r>
-    </w:p>
-    <w:p>
-      <w:pPr>
-        <w:pStyle w:val="ListNumber"/>
-      </w:pPr>
-      <w:r>
-        <w:t>Test with one real purchase on your phone from the homepage teaser to the confirmation email, then refund it.</w:t>
-      </w:r>
-    </w:p>
-    <w:p>
-      <w:r>
-        <w:rPr>
-          <w:b/>
-          <w:i w:val="0"/>
-        </w:rPr>
-        <w:t>Checkout page copy [approved]:</w:t>
-      </w:r>
-    </w:p>
-    <w:p>
-      <w:r>
-        <w:rPr>
-          <w:b/>
-          <w:color w:val="5E4B42"/>
-        </w:rPr>
-        <w:t xml:space="preserve">Headline  </w:t>
-      </w:r>
-      <w:r>
-        <w:t>Book Your Next Step</w:t>
-      </w:r>
-    </w:p>
-    <w:p>
-      <w:r>
-        <w:rPr>
-          <w:b/>
-          <w:color w:val="5E4B42"/>
-        </w:rPr>
-        <w:t xml:space="preserve">Body  </w:t>
-      </w:r>
-      <w:r>
-        <w:t>A 60-minute private coaching session on Zoom with Nechelle Marie.</w:t>
-      </w:r>
-    </w:p>
-    <w:p>
-      <w:r>
-        <w:rPr>
-          <w:b/>
-          <w:color w:val="5E4B42"/>
-        </w:rPr>
-        <w:t xml:space="preserve">Price  </w:t>
-      </w:r>
-      <w:r>
-        <w:t>$125, one-time payment</w:t>
-      </w:r>
-    </w:p>
-    <w:p>
-      <w:r>
-        <w:rPr>
-          <w:b/>
-          <w:color w:val="5E4B42"/>
-        </w:rPr>
-        <w:t xml:space="preserve">List  </w:t>
-      </w:r>
-      <w:r>
-        <w:t>You’ll leave with: One priority to focus on. A practical boundary to support your next step. A seven-day action plan that fits your life.</w:t>
-      </w:r>
-    </w:p>
-    <w:p>
-      <w:r>
-        <w:rPr>
-          <w:b/>
-          <w:color w:val="5E4B42"/>
-        </w:rPr>
-        <w:t xml:space="preserve">Line  </w:t>
-      </w:r>
-      <w:r>
-        <w:t>After payment, you’ll choose your session time on the next page.</w:t>
-      </w:r>
-    </w:p>
-    <w:p>
-      <w:r>
-        <w:rPr>
-          <w:b/>
-          <w:color w:val="5E4B42"/>
-        </w:rPr>
-        <w:t xml:space="preserve">Button  </w:t>
-      </w:r>
-      <w:r>
-        <w:t>Complete My Booking</w:t>
-      </w:r>
-    </w:p>
-    <w:p>
-      <w:r>
-        <w:rPr>
-          <w:b/>
-          <w:color w:val="5E4B42"/>
-        </w:rPr>
-        <w:t xml:space="preserve">Below button  </w:t>
-      </w:r>
-      <w:r>
-        <w:t>Secure payment through Stripe or PayPal.</w:t>
-      </w:r>
-    </w:p>
-    <w:p>
-      <w:r>
-        <w:rPr>
-          <w:b/>
-          <w:i w:val="0"/>
-        </w:rPr>
-        <w:t>Choose Your Time page copy [approved]:</w:t>
-      </w:r>
-    </w:p>
-    <w:p>
-      <w:r>
-        <w:rPr>
-          <w:b/>
-          <w:color w:val="5E4B42"/>
-        </w:rPr>
-        <w:t xml:space="preserve">Headline  </w:t>
-      </w:r>
-      <w:r>
-        <w:t>You’re in. Now choose your time.</w:t>
-      </w:r>
-    </w:p>
-    <w:p>
-      <w:r>
-        <w:rPr>
-          <w:b/>
-          <w:color w:val="5E4B42"/>
-        </w:rPr>
-        <w:t xml:space="preserve">Body  </w:t>
-      </w:r>
-      <w:r>
-        <w:t>Pick the day and time that work best for you. Your confirmation email will include the Zoom link for your session.</w:t>
-      </w:r>
-    </w:p>
-    <w:p>
-      <w:r>
-        <w:rPr>
-          <w:b/>
-          <w:color w:val="5E4B42"/>
-        </w:rPr>
-        <w:t xml:space="preserve">Calendar  </w:t>
-      </w:r>
-      <w:r>
-        <w:t>systeme.io calendar element: Your Next Step event</w:t>
-      </w:r>
-    </w:p>
-    <w:p>
-      <w:r>
-        <w:rPr>
-          <w:b/>
-          <w:color w:val="5E4B42"/>
-        </w:rPr>
-        <w:t xml:space="preserve">Below  </w:t>
-      </w:r>
-      <w:r>
-        <w:t>Need to reschedule? Email nechelle@iamnechellemarie.com at least 24 hours before your session.</w:t>
-      </w:r>
-    </w:p>
-    <w:p>
-      <w:r>
-        <w:rPr>
-          <w:b/>
-          <w:color w:val="5E4B42"/>
-        </w:rPr>
-        <w:t xml:space="preserve">Close  </w:t>
-      </w:r>
-      <w:r>
-        <w:t>I’m looking forward to our hour together. Nechelle Marie</w:t>
-      </w:r>
-    </w:p>
-    <w:p>
-      <w:r>
-        <w:rPr>
-          <w:b/>
-          <w:i w:val="0"/>
-        </w:rPr>
-        <w:t>Legal pages to update with this switch: the Terms and Privacy Policy currently name Calendly for scheduling. Switch them to systeme.io for checkout and scheduling. I will send the updated paste kit code when you confirm the switch date.</w:t>
+        <w:t>Track completed bookings in Calendly (scheduled events for the Your Next Step event) and match them to Stripe or PayPal payments each week.</w:t>
       </w:r>
     </w:p>
     <w:sectPr>

</xml_diff>